<commit_message>
updated tmois lab 2 otchet
</commit_message>
<xml_diff>
--- a/tmois/lab2/отчет_пальчевский_2_тмоис.docx
+++ b/tmois/lab2/отчет_пальчевский_2_тмоис.docx
@@ -940,12 +940,12 @@
             <wp:extent cx="4408319" cy="5005462"/>
             <wp:effectExtent b="0" l="0" r="0" t="0"/>
             <wp:wrapTopAndBottom distB="114300" distT="114300"/>
-            <wp:docPr id="3" name="image1.png"/>
+            <wp:docPr id="2" name="image2.png"/>
             <a:graphic>
               <a:graphicData uri="http://schemas.openxmlformats.org/drawingml/2006/picture">
                 <pic:pic>
                   <pic:nvPicPr>
-                    <pic:cNvPr id="0" name="image1.png"/>
+                    <pic:cNvPr id="0" name="image2.png"/>
                     <pic:cNvPicPr preferRelativeResize="0"/>
                   </pic:nvPicPr>
                   <pic:blipFill>
@@ -1155,20 +1155,20 @@
           <wp:anchor allowOverlap="1" behindDoc="0" distB="114300" distT="114300" distL="114300" distR="114300" hidden="0" layoutInCell="1" locked="0" relativeHeight="0" simplePos="0">
             <wp:simplePos x="0" y="0"/>
             <wp:positionH relativeFrom="column">
-              <wp:posOffset>133350</wp:posOffset>
+              <wp:posOffset>1677413</wp:posOffset>
             </wp:positionH>
             <wp:positionV relativeFrom="paragraph">
-              <wp:posOffset>572746</wp:posOffset>
+              <wp:posOffset>161925</wp:posOffset>
             </wp:positionV>
-            <wp:extent cx="5731200" cy="4381500"/>
+            <wp:extent cx="2390775" cy="4181475"/>
             <wp:effectExtent b="0" l="0" r="0" t="0"/>
             <wp:wrapTopAndBottom distB="114300" distT="114300"/>
-            <wp:docPr id="2" name="image4.png"/>
+            <wp:docPr id="3" name="image1.png"/>
             <a:graphic>
               <a:graphicData uri="http://schemas.openxmlformats.org/drawingml/2006/picture">
                 <pic:pic>
                   <pic:nvPicPr>
-                    <pic:cNvPr id="0" name="image4.png"/>
+                    <pic:cNvPr id="0" name="image1.png"/>
                     <pic:cNvPicPr preferRelativeResize="0"/>
                   </pic:nvPicPr>
                   <pic:blipFill>
@@ -1181,7 +1181,7 @@
                   <pic:spPr>
                     <a:xfrm>
                       <a:off x="0" y="0"/>
-                      <a:ext cx="5731200" cy="4381500"/>
+                      <a:ext cx="2390775" cy="4181475"/>
                     </a:xfrm>
                     <a:prstGeom prst="rect"/>
                     <a:ln/>
@@ -1363,12 +1363,12 @@
             <wp:extent cx="4124212" cy="4682871"/>
             <wp:effectExtent b="0" l="0" r="0" t="0"/>
             <wp:wrapTopAndBottom distB="114300" distT="114300"/>
-            <wp:docPr id="4" name="image2.png"/>
+            <wp:docPr id="4" name="image4.png"/>
             <a:graphic>
               <a:graphicData uri="http://schemas.openxmlformats.org/drawingml/2006/picture">
                 <pic:pic>
                   <pic:nvPicPr>
-                    <pic:cNvPr id="0" name="image2.png"/>
+                    <pic:cNvPr id="0" name="image4.png"/>
                     <pic:cNvPicPr preferRelativeResize="0"/>
                   </pic:nvPicPr>
                   <pic:blipFill>

</xml_diff>